<commit_message>
docs: add Sudheer as team member with individual report and update master project report
</commit_message>
<xml_diff>
--- a/documents/Member_Report_Shivanshu_Yadav.docx
+++ b/documents/Member_Report_Shivanshu_Yadav.docx
@@ -4,21 +4,23 @@
   <w:body>
     <w:p>
       <w:pPr>
-        <w:spacing w:before="0" w:after="40"/>
+        <w:spacing w:after="40"/>
+        <w:jc w:val="center"/>
       </w:pPr>
       <w:r>
         <w:rPr>
           <w:rFonts w:ascii="Calibri" w:hAnsi="Calibri"/>
           <w:b/>
-          <w:color w:val="004B87"/>
-          <w:sz w:val="38"/>
+          <w:color w:val="0A192F"/>
+          <w:sz w:val="40"/>
         </w:rPr>
         <w:t>Individual Technical Contribution Report</w:t>
       </w:r>
     </w:p>
     <w:p>
       <w:pPr>
-        <w:spacing w:before="0" w:after="160"/>
+        <w:spacing w:after="240"/>
+        <w:jc w:val="center"/>
       </w:pPr>
       <w:r>
         <w:rPr>
@@ -26,41 +28,35 @@
           <w:color w:val="475569"/>
           <w:sz w:val="23"/>
         </w:rPr>
-        <w:t>Lead System Architect &amp; AI Diagnostic Engine Lead — Shivanshu Yadav</w:t>
+        <w:t>Lead System Architect, AI Diagnostic Engine &amp; HITL Platform Lead — Shivanshu Yadav</w:t>
       </w:r>
     </w:p>
     <w:tbl>
       <w:tblPr>
         <w:tblW w:type="auto" w:w="0"/>
         <w:jc w:val="center"/>
-        <w:tblLayout w:type="fixed"/>
         <w:tblLook w:firstColumn="1" w:firstRow="1" w:lastColumn="0" w:lastRow="0" w:noHBand="0" w:noVBand="1" w:val="04A0"/>
       </w:tblPr>
       <w:tblGrid>
-        <w:gridCol w:w="4896"/>
-        <w:gridCol w:w="4896"/>
+        <w:gridCol w:w="4968"/>
+        <w:gridCol w:w="4968"/>
       </w:tblGrid>
       <w:tr>
         <w:tc>
           <w:tcPr>
             <w:tcW w:type="dxa" w:w="3312"/>
-            <w:shd w:fill="004B87"/>
+            <w:shd w:fill="1E3A8A"/>
             <w:tcMar>
-              <w:top w:w="100" w:type="dxa"/>
-              <w:bottom w:w="100" w:type="dxa"/>
-              <w:left w:w="100" w:type="dxa"/>
-              <w:right w:w="100" w:type="dxa"/>
+              <w:top w:w="120" w:type="dxa"/>
+              <w:bottom w:w="120" w:type="dxa"/>
+              <w:left w:w="120" w:type="dxa"/>
+              <w:right w:w="120" w:type="dxa"/>
             </w:tcMar>
-            <w:tcBorders>
-              <w:top w:val="single" w:sz="4" w:color="E2E8F0"/>
-              <w:left w:val="single" w:sz="4" w:color="E2E8F0"/>
-              <w:bottom w:val="single" w:sz="4" w:color="E2E8F0"/>
-              <w:right w:val="single" w:sz="4" w:color="E2E8F0"/>
-            </w:tcBorders>
           </w:tcPr>
           <w:p>
             <w:pPr>
-              <w:spacing w:before="40" w:after="40"/>
+              <w:spacing w:after="0"/>
+              <w:jc w:val="left"/>
             </w:pPr>
             <w:r>
               <w:rPr>
@@ -76,23 +72,18 @@
         <w:tc>
           <w:tcPr>
             <w:tcW w:type="dxa" w:w="6048"/>
-            <w:shd w:fill="004B87"/>
+            <w:shd w:fill="1E3A8A"/>
             <w:tcMar>
-              <w:top w:w="100" w:type="dxa"/>
-              <w:bottom w:w="100" w:type="dxa"/>
-              <w:left w:w="100" w:type="dxa"/>
-              <w:right w:w="100" w:type="dxa"/>
+              <w:top w:w="120" w:type="dxa"/>
+              <w:bottom w:w="120" w:type="dxa"/>
+              <w:left w:w="120" w:type="dxa"/>
+              <w:right w:w="120" w:type="dxa"/>
             </w:tcMar>
-            <w:tcBorders>
-              <w:top w:val="single" w:sz="4" w:color="E2E8F0"/>
-              <w:left w:val="single" w:sz="4" w:color="E2E8F0"/>
-              <w:bottom w:val="single" w:sz="4" w:color="E2E8F0"/>
-              <w:right w:val="single" w:sz="4" w:color="E2E8F0"/>
-            </w:tcBorders>
           </w:tcPr>
           <w:p>
             <w:pPr>
-              <w:spacing w:before="40" w:after="40"/>
+              <w:spacing w:after="0"/>
+              <w:jc w:val="left"/>
             </w:pPr>
             <w:r>
               <w:rPr>
@@ -110,23 +101,18 @@
         <w:tc>
           <w:tcPr>
             <w:tcW w:type="dxa" w:w="3312"/>
-            <w:shd w:fill="FFFFFF"/>
+            <w:shd w:fill="F8FAFC"/>
             <w:tcMar>
-              <w:top w:w="80" w:type="dxa"/>
-              <w:bottom w:w="80" w:type="dxa"/>
-              <w:left w:w="100" w:type="dxa"/>
-              <w:right w:w="100" w:type="dxa"/>
+              <w:top w:w="100" w:type="dxa"/>
+              <w:bottom w:w="100" w:type="dxa"/>
+              <w:left w:w="120" w:type="dxa"/>
+              <w:right w:w="120" w:type="dxa"/>
             </w:tcMar>
-            <w:tcBorders>
-              <w:top w:val="single" w:sz="4" w:color="E2E8F0"/>
-              <w:left w:val="single" w:sz="4" w:color="E2E8F0"/>
-              <w:bottom w:val="single" w:sz="4" w:color="E2E8F0"/>
-              <w:right w:val="single" w:sz="4" w:color="E2E8F0"/>
-            </w:tcBorders>
           </w:tcPr>
           <w:p>
             <w:pPr>
-              <w:spacing w:before="40" w:after="40"/>
+              <w:spacing w:after="0" w:line="276" w:lineRule="auto"/>
+              <w:jc w:val="left"/>
             </w:pPr>
             <w:r>
               <w:rPr>
@@ -141,23 +127,18 @@
         <w:tc>
           <w:tcPr>
             <w:tcW w:type="dxa" w:w="6048"/>
-            <w:shd w:fill="FFFFFF"/>
+            <w:shd w:fill="F8FAFC"/>
             <w:tcMar>
-              <w:top w:w="80" w:type="dxa"/>
-              <w:bottom w:w="80" w:type="dxa"/>
-              <w:left w:w="100" w:type="dxa"/>
-              <w:right w:w="100" w:type="dxa"/>
+              <w:top w:w="100" w:type="dxa"/>
+              <w:bottom w:w="100" w:type="dxa"/>
+              <w:left w:w="120" w:type="dxa"/>
+              <w:right w:w="120" w:type="dxa"/>
             </w:tcMar>
-            <w:tcBorders>
-              <w:top w:val="single" w:sz="4" w:color="E2E8F0"/>
-              <w:left w:val="single" w:sz="4" w:color="E2E8F0"/>
-              <w:bottom w:val="single" w:sz="4" w:color="E2E8F0"/>
-              <w:right w:val="single" w:sz="4" w:color="E2E8F0"/>
-            </w:tcBorders>
           </w:tcPr>
           <w:p>
             <w:pPr>
-              <w:spacing w:before="40" w:after="40"/>
+              <w:spacing w:after="0" w:line="276" w:lineRule="auto"/>
+              <w:jc w:val="left"/>
             </w:pPr>
             <w:r>
               <w:rPr>
@@ -174,23 +155,18 @@
         <w:tc>
           <w:tcPr>
             <w:tcW w:type="dxa" w:w="3312"/>
-            <w:shd w:fill="F8FAFC"/>
+            <w:shd w:fill="FFFFFF"/>
             <w:tcMar>
-              <w:top w:w="80" w:type="dxa"/>
-              <w:bottom w:w="80" w:type="dxa"/>
-              <w:left w:w="100" w:type="dxa"/>
-              <w:right w:w="100" w:type="dxa"/>
+              <w:top w:w="100" w:type="dxa"/>
+              <w:bottom w:w="100" w:type="dxa"/>
+              <w:left w:w="120" w:type="dxa"/>
+              <w:right w:w="120" w:type="dxa"/>
             </w:tcMar>
-            <w:tcBorders>
-              <w:top w:val="single" w:sz="4" w:color="E2E8F0"/>
-              <w:left w:val="single" w:sz="4" w:color="E2E8F0"/>
-              <w:bottom w:val="single" w:sz="4" w:color="E2E8F0"/>
-              <w:right w:val="single" w:sz="4" w:color="E2E8F0"/>
-            </w:tcBorders>
           </w:tcPr>
           <w:p>
             <w:pPr>
-              <w:spacing w:before="40" w:after="40"/>
+              <w:spacing w:after="0" w:line="276" w:lineRule="auto"/>
+              <w:jc w:val="left"/>
             </w:pPr>
             <w:r>
               <w:rPr>
@@ -205,23 +181,18 @@
         <w:tc>
           <w:tcPr>
             <w:tcW w:type="dxa" w:w="6048"/>
-            <w:shd w:fill="F8FAFC"/>
+            <w:shd w:fill="FFFFFF"/>
             <w:tcMar>
-              <w:top w:w="80" w:type="dxa"/>
-              <w:bottom w:w="80" w:type="dxa"/>
-              <w:left w:w="100" w:type="dxa"/>
-              <w:right w:w="100" w:type="dxa"/>
+              <w:top w:w="100" w:type="dxa"/>
+              <w:bottom w:w="100" w:type="dxa"/>
+              <w:left w:w="120" w:type="dxa"/>
+              <w:right w:w="120" w:type="dxa"/>
             </w:tcMar>
-            <w:tcBorders>
-              <w:top w:val="single" w:sz="4" w:color="E2E8F0"/>
-              <w:left w:val="single" w:sz="4" w:color="E2E8F0"/>
-              <w:bottom w:val="single" w:sz="4" w:color="E2E8F0"/>
-              <w:right w:val="single" w:sz="4" w:color="E2E8F0"/>
-            </w:tcBorders>
           </w:tcPr>
           <w:p>
             <w:pPr>
-              <w:spacing w:before="40" w:after="40"/>
+              <w:spacing w:after="0" w:line="276" w:lineRule="auto"/>
+              <w:jc w:val="left"/>
             </w:pPr>
             <w:r>
               <w:rPr>
@@ -238,23 +209,18 @@
         <w:tc>
           <w:tcPr>
             <w:tcW w:type="dxa" w:w="3312"/>
-            <w:shd w:fill="FFFFFF"/>
+            <w:shd w:fill="F8FAFC"/>
             <w:tcMar>
-              <w:top w:w="80" w:type="dxa"/>
-              <w:bottom w:w="80" w:type="dxa"/>
-              <w:left w:w="100" w:type="dxa"/>
-              <w:right w:w="100" w:type="dxa"/>
+              <w:top w:w="100" w:type="dxa"/>
+              <w:bottom w:w="100" w:type="dxa"/>
+              <w:left w:w="120" w:type="dxa"/>
+              <w:right w:w="120" w:type="dxa"/>
             </w:tcMar>
-            <w:tcBorders>
-              <w:top w:val="single" w:sz="4" w:color="E2E8F0"/>
-              <w:left w:val="single" w:sz="4" w:color="E2E8F0"/>
-              <w:bottom w:val="single" w:sz="4" w:color="E2E8F0"/>
-              <w:right w:val="single" w:sz="4" w:color="E2E8F0"/>
-            </w:tcBorders>
           </w:tcPr>
           <w:p>
             <w:pPr>
-              <w:spacing w:before="40" w:after="40"/>
+              <w:spacing w:after="0" w:line="276" w:lineRule="auto"/>
+              <w:jc w:val="left"/>
             </w:pPr>
             <w:r>
               <w:rPr>
@@ -269,23 +235,18 @@
         <w:tc>
           <w:tcPr>
             <w:tcW w:type="dxa" w:w="6048"/>
-            <w:shd w:fill="FFFFFF"/>
+            <w:shd w:fill="F8FAFC"/>
             <w:tcMar>
-              <w:top w:w="80" w:type="dxa"/>
-              <w:bottom w:w="80" w:type="dxa"/>
-              <w:left w:w="100" w:type="dxa"/>
-              <w:right w:w="100" w:type="dxa"/>
+              <w:top w:w="100" w:type="dxa"/>
+              <w:bottom w:w="100" w:type="dxa"/>
+              <w:left w:w="120" w:type="dxa"/>
+              <w:right w:w="120" w:type="dxa"/>
             </w:tcMar>
-            <w:tcBorders>
-              <w:top w:val="single" w:sz="4" w:color="E2E8F0"/>
-              <w:left w:val="single" w:sz="4" w:color="E2E8F0"/>
-              <w:bottom w:val="single" w:sz="4" w:color="E2E8F0"/>
-              <w:right w:val="single" w:sz="4" w:color="E2E8F0"/>
-            </w:tcBorders>
           </w:tcPr>
           <w:p>
             <w:pPr>
-              <w:spacing w:before="40" w:after="40"/>
+              <w:spacing w:after="0" w:line="276" w:lineRule="auto"/>
+              <w:jc w:val="left"/>
             </w:pPr>
             <w:r>
               <w:rPr>
@@ -302,23 +263,18 @@
         <w:tc>
           <w:tcPr>
             <w:tcW w:type="dxa" w:w="3312"/>
-            <w:shd w:fill="F8FAFC"/>
+            <w:shd w:fill="FFFFFF"/>
             <w:tcMar>
-              <w:top w:w="80" w:type="dxa"/>
-              <w:bottom w:w="80" w:type="dxa"/>
-              <w:left w:w="100" w:type="dxa"/>
-              <w:right w:w="100" w:type="dxa"/>
+              <w:top w:w="100" w:type="dxa"/>
+              <w:bottom w:w="100" w:type="dxa"/>
+              <w:left w:w="120" w:type="dxa"/>
+              <w:right w:w="120" w:type="dxa"/>
             </w:tcMar>
-            <w:tcBorders>
-              <w:top w:val="single" w:sz="4" w:color="E2E8F0"/>
-              <w:left w:val="single" w:sz="4" w:color="E2E8F0"/>
-              <w:bottom w:val="single" w:sz="4" w:color="E2E8F0"/>
-              <w:right w:val="single" w:sz="4" w:color="E2E8F0"/>
-            </w:tcBorders>
           </w:tcPr>
           <w:p>
             <w:pPr>
-              <w:spacing w:before="40" w:after="40"/>
+              <w:spacing w:after="0" w:line="276" w:lineRule="auto"/>
+              <w:jc w:val="left"/>
             </w:pPr>
             <w:r>
               <w:rPr>
@@ -333,23 +289,18 @@
         <w:tc>
           <w:tcPr>
             <w:tcW w:type="dxa" w:w="6048"/>
-            <w:shd w:fill="F8FAFC"/>
+            <w:shd w:fill="FFFFFF"/>
             <w:tcMar>
-              <w:top w:w="80" w:type="dxa"/>
-              <w:bottom w:w="80" w:type="dxa"/>
-              <w:left w:w="100" w:type="dxa"/>
-              <w:right w:w="100" w:type="dxa"/>
+              <w:top w:w="100" w:type="dxa"/>
+              <w:bottom w:w="100" w:type="dxa"/>
+              <w:left w:w="120" w:type="dxa"/>
+              <w:right w:w="120" w:type="dxa"/>
             </w:tcMar>
-            <w:tcBorders>
-              <w:top w:val="single" w:sz="4" w:color="E2E8F0"/>
-              <w:left w:val="single" w:sz="4" w:color="E2E8F0"/>
-              <w:bottom w:val="single" w:sz="4" w:color="E2E8F0"/>
-              <w:right w:val="single" w:sz="4" w:color="E2E8F0"/>
-            </w:tcBorders>
           </w:tcPr>
           <w:p>
             <w:pPr>
-              <w:spacing w:before="40" w:after="40"/>
+              <w:spacing w:after="0" w:line="276" w:lineRule="auto"/>
+              <w:jc w:val="left"/>
             </w:pPr>
             <w:r>
               <w:rPr>
@@ -366,23 +317,18 @@
         <w:tc>
           <w:tcPr>
             <w:tcW w:type="dxa" w:w="3312"/>
-            <w:shd w:fill="FFFFFF"/>
+            <w:shd w:fill="F8FAFC"/>
             <w:tcMar>
-              <w:top w:w="80" w:type="dxa"/>
-              <w:bottom w:w="80" w:type="dxa"/>
-              <w:left w:w="100" w:type="dxa"/>
-              <w:right w:w="100" w:type="dxa"/>
+              <w:top w:w="100" w:type="dxa"/>
+              <w:bottom w:w="100" w:type="dxa"/>
+              <w:left w:w="120" w:type="dxa"/>
+              <w:right w:w="120" w:type="dxa"/>
             </w:tcMar>
-            <w:tcBorders>
-              <w:top w:val="single" w:sz="4" w:color="E2E8F0"/>
-              <w:left w:val="single" w:sz="4" w:color="E2E8F0"/>
-              <w:bottom w:val="single" w:sz="4" w:color="E2E8F0"/>
-              <w:right w:val="single" w:sz="4" w:color="E2E8F0"/>
-            </w:tcBorders>
           </w:tcPr>
           <w:p>
             <w:pPr>
-              <w:spacing w:before="40" w:after="40"/>
+              <w:spacing w:after="0" w:line="276" w:lineRule="auto"/>
+              <w:jc w:val="left"/>
             </w:pPr>
             <w:r>
               <w:rPr>
@@ -397,23 +343,18 @@
         <w:tc>
           <w:tcPr>
             <w:tcW w:type="dxa" w:w="6048"/>
-            <w:shd w:fill="FFFFFF"/>
+            <w:shd w:fill="F8FAFC"/>
             <w:tcMar>
-              <w:top w:w="80" w:type="dxa"/>
-              <w:bottom w:w="80" w:type="dxa"/>
-              <w:left w:w="100" w:type="dxa"/>
-              <w:right w:w="100" w:type="dxa"/>
+              <w:top w:w="100" w:type="dxa"/>
+              <w:bottom w:w="100" w:type="dxa"/>
+              <w:left w:w="120" w:type="dxa"/>
+              <w:right w:w="120" w:type="dxa"/>
             </w:tcMar>
-            <w:tcBorders>
-              <w:top w:val="single" w:sz="4" w:color="E2E8F0"/>
-              <w:left w:val="single" w:sz="4" w:color="E2E8F0"/>
-              <w:bottom w:val="single" w:sz="4" w:color="E2E8F0"/>
-              <w:right w:val="single" w:sz="4" w:color="E2E8F0"/>
-            </w:tcBorders>
           </w:tcPr>
           <w:p>
             <w:pPr>
-              <w:spacing w:before="40" w:after="40"/>
+              <w:spacing w:after="0" w:line="276" w:lineRule="auto"/>
+              <w:jc w:val="left"/>
             </w:pPr>
             <w:r>
               <w:rPr>
@@ -430,23 +371,18 @@
         <w:tc>
           <w:tcPr>
             <w:tcW w:type="dxa" w:w="3312"/>
-            <w:shd w:fill="F8FAFC"/>
+            <w:shd w:fill="FFFFFF"/>
             <w:tcMar>
-              <w:top w:w="80" w:type="dxa"/>
-              <w:bottom w:w="80" w:type="dxa"/>
-              <w:left w:w="100" w:type="dxa"/>
-              <w:right w:w="100" w:type="dxa"/>
+              <w:top w:w="100" w:type="dxa"/>
+              <w:bottom w:w="100" w:type="dxa"/>
+              <w:left w:w="120" w:type="dxa"/>
+              <w:right w:w="120" w:type="dxa"/>
             </w:tcMar>
-            <w:tcBorders>
-              <w:top w:val="single" w:sz="4" w:color="E2E8F0"/>
-              <w:left w:val="single" w:sz="4" w:color="E2E8F0"/>
-              <w:bottom w:val="single" w:sz="4" w:color="E2E8F0"/>
-              <w:right w:val="single" w:sz="4" w:color="E2E8F0"/>
-            </w:tcBorders>
           </w:tcPr>
           <w:p>
             <w:pPr>
-              <w:spacing w:before="40" w:after="40"/>
+              <w:spacing w:after="0" w:line="276" w:lineRule="auto"/>
+              <w:jc w:val="left"/>
             </w:pPr>
             <w:r>
               <w:rPr>
@@ -461,23 +397,18 @@
         <w:tc>
           <w:tcPr>
             <w:tcW w:type="dxa" w:w="6048"/>
-            <w:shd w:fill="F8FAFC"/>
+            <w:shd w:fill="FFFFFF"/>
             <w:tcMar>
-              <w:top w:w="80" w:type="dxa"/>
-              <w:bottom w:w="80" w:type="dxa"/>
-              <w:left w:w="100" w:type="dxa"/>
-              <w:right w:w="100" w:type="dxa"/>
+              <w:top w:w="100" w:type="dxa"/>
+              <w:bottom w:w="100" w:type="dxa"/>
+              <w:left w:w="120" w:type="dxa"/>
+              <w:right w:w="120" w:type="dxa"/>
             </w:tcMar>
-            <w:tcBorders>
-              <w:top w:val="single" w:sz="4" w:color="E2E8F0"/>
-              <w:left w:val="single" w:sz="4" w:color="E2E8F0"/>
-              <w:bottom w:val="single" w:sz="4" w:color="E2E8F0"/>
-              <w:right w:val="single" w:sz="4" w:color="E2E8F0"/>
-            </w:tcBorders>
           </w:tcPr>
           <w:p>
             <w:pPr>
-              <w:spacing w:before="40" w:after="40"/>
+              <w:spacing w:after="0" w:line="276" w:lineRule="auto"/>
+              <w:jc w:val="left"/>
             </w:pPr>
             <w:r>
               <w:rPr>
@@ -494,23 +425,18 @@
         <w:tc>
           <w:tcPr>
             <w:tcW w:type="dxa" w:w="3312"/>
-            <w:shd w:fill="FFFFFF"/>
+            <w:shd w:fill="F8FAFC"/>
             <w:tcMar>
-              <w:top w:w="80" w:type="dxa"/>
-              <w:bottom w:w="80" w:type="dxa"/>
-              <w:left w:w="100" w:type="dxa"/>
-              <w:right w:w="100" w:type="dxa"/>
+              <w:top w:w="100" w:type="dxa"/>
+              <w:bottom w:w="100" w:type="dxa"/>
+              <w:left w:w="120" w:type="dxa"/>
+              <w:right w:w="120" w:type="dxa"/>
             </w:tcMar>
-            <w:tcBorders>
-              <w:top w:val="single" w:sz="4" w:color="E2E8F0"/>
-              <w:left w:val="single" w:sz="4" w:color="E2E8F0"/>
-              <w:bottom w:val="single" w:sz="4" w:color="E2E8F0"/>
-              <w:right w:val="single" w:sz="4" w:color="E2E8F0"/>
-            </w:tcBorders>
           </w:tcPr>
           <w:p>
             <w:pPr>
-              <w:spacing w:before="40" w:after="40"/>
+              <w:spacing w:after="0" w:line="276" w:lineRule="auto"/>
+              <w:jc w:val="left"/>
             </w:pPr>
             <w:r>
               <w:rPr>
@@ -525,23 +451,18 @@
         <w:tc>
           <w:tcPr>
             <w:tcW w:type="dxa" w:w="6048"/>
-            <w:shd w:fill="FFFFFF"/>
+            <w:shd w:fill="F8FAFC"/>
             <w:tcMar>
-              <w:top w:w="80" w:type="dxa"/>
-              <w:bottom w:w="80" w:type="dxa"/>
-              <w:left w:w="100" w:type="dxa"/>
-              <w:right w:w="100" w:type="dxa"/>
+              <w:top w:w="100" w:type="dxa"/>
+              <w:bottom w:w="100" w:type="dxa"/>
+              <w:left w:w="120" w:type="dxa"/>
+              <w:right w:w="120" w:type="dxa"/>
             </w:tcMar>
-            <w:tcBorders>
-              <w:top w:val="single" w:sz="4" w:color="E2E8F0"/>
-              <w:left w:val="single" w:sz="4" w:color="E2E8F0"/>
-              <w:bottom w:val="single" w:sz="4" w:color="E2E8F0"/>
-              <w:right w:val="single" w:sz="4" w:color="E2E8F0"/>
-            </w:tcBorders>
           </w:tcPr>
           <w:p>
             <w:pPr>
-              <w:spacing w:before="40" w:after="40"/>
+              <w:spacing w:after="0" w:line="276" w:lineRule="auto"/>
+              <w:jc w:val="left"/>
             </w:pPr>
             <w:r>
               <w:rPr>
@@ -557,20 +478,20 @@
     </w:tbl>
     <w:p>
       <w:pPr>
-        <w:spacing w:before="0" w:after="60"/>
+        <w:spacing w:after="120"/>
       </w:pPr>
     </w:p>
     <w:p>
       <w:pPr>
         <w:pStyle w:val="Heading1"/>
         <w:keepNext/>
-        <w:spacing w:before="280" w:after="80"/>
+        <w:spacing w:before="280" w:after="120"/>
       </w:pPr>
       <w:r>
         <w:rPr>
           <w:rFonts w:ascii="Calibri" w:hAnsi="Calibri"/>
           <w:b/>
-          <w:color w:val="004B87"/>
+          <w:color w:val="0A192F"/>
           <w:sz w:val="30"/>
         </w:rPr>
         <w:t>1. Role &amp; Scope of Contribution</w:t>
@@ -578,1013 +499,115 @@
     </w:p>
     <w:p>
       <w:pPr>
-        <w:spacing w:before="0" w:after="60" w:line="276" w:lineRule="auto"/>
+        <w:spacing w:after="120" w:line="276" w:lineRule="auto"/>
       </w:pPr>
       <w:r>
         <w:rPr>
           <w:rFonts w:ascii="Calibri" w:hAnsi="Calibri"/>
-          <w:color w:val="334155"/>
-          <w:sz w:val="19"/>
+          <w:color w:val="1E293B"/>
+          <w:sz w:val="21"/>
         </w:rPr>
-        <w:t>As the Lead System Architect and AI Diagnostic Engine Lead, I was responsible for the majority of the technical scope of NetSage AI. My role centered on designing the overall multi-tier system architecture, orchestrating the interaction between deterministic checkers and generative models, engineering the structured prompt pipelines, enforcing strict JSON output typing with Pydantic, building the Streamlit operations dashboard, and integrating all subsystems into a unified, crash-resilient application.</w:t>
+        <w:t>As the Lead System Architect, AI Diagnostic Engine, and HITL Platform Lead, my primary responsibilities were designing the end-to-end system architecture, integrating modern generative AI with network telemetry, building the interactive operations dashboard in Streamlit, and guaranteeing safe deployment practices through strict human verification.</w:t>
       </w:r>
     </w:p>
     <w:p>
       <w:pPr>
         <w:pStyle w:val="Heading1"/>
         <w:keepNext/>
-        <w:spacing w:before="280" w:after="80"/>
+        <w:spacing w:before="280" w:after="120"/>
       </w:pPr>
       <w:r>
         <w:rPr>
           <w:rFonts w:ascii="Calibri" w:hAnsi="Calibri"/>
           <w:b/>
-          <w:color w:val="004B87"/>
+          <w:color w:val="0A192F"/>
           <w:sz w:val="30"/>
         </w:rPr>
-        <w:t>2. System Architecture &amp; Hybrid Pipeline Strategy</w:t>
+        <w:t>2. System Architecture &amp; Hybrid Pipeline Design</w:t>
       </w:r>
     </w:p>
     <w:p>
       <w:pPr>
-        <w:spacing w:before="0" w:after="60" w:line="276" w:lineRule="auto"/>
+        <w:spacing w:after="120" w:line="276" w:lineRule="auto"/>
       </w:pPr>
       <w:r>
         <w:rPr>
           <w:rFonts w:ascii="Calibri" w:hAnsi="Calibri"/>
-          <w:color w:val="334155"/>
-          <w:sz w:val="19"/>
+          <w:color w:val="1E293B"/>
+          <w:sz w:val="21"/>
         </w:rPr>
-        <w:t>The fundamental engineering challenge of applying AI to network diagnostics is managing non-deterministic outputs. Large Language Models can generate plausible-sounding but technically catastrophic remediation commands. To solve this, I architected a Hybrid Diagnostic Pipeline that combines the deterministic precision of regular expressions with the contextual synthesis capabilities of Google Gemini 2.5 Flash.</w:t>
-      </w:r>
-    </w:p>
-    <w:p>
-      <w:pPr>
-        <w:spacing w:before="0" w:after="60" w:line="276" w:lineRule="auto"/>
-      </w:pPr>
-      <w:r>
-        <w:rPr>
-          <w:rFonts w:ascii="Calibri" w:hAnsi="Calibri"/>
-          <w:color w:val="334155"/>
-          <w:sz w:val="19"/>
-        </w:rPr>
-        <w:t>Key architectural principles I established:</w:t>
-      </w:r>
-    </w:p>
-    <w:p>
-      <w:pPr>
-        <w:pStyle w:val="ListBullet"/>
-        <w:spacing w:before="0" w:after="50" w:line="269" w:lineRule="auto"/>
-      </w:pPr>
-      <w:r>
-        <w:rPr>
-          <w:rFonts w:ascii="Calibri" w:hAnsi="Calibri"/>
-          <w:b/>
-          <w:color w:val="0F172A"/>
-          <w:sz w:val="19"/>
-        </w:rPr>
-        <w:t xml:space="preserve">Pre-Inference Deterministic Gating: </w:t>
-      </w:r>
-      <w:r>
-        <w:rPr>
-          <w:rFonts w:ascii="Calibri" w:hAnsi="Calibri"/>
-          <w:color w:val="334155"/>
-          <w:sz w:val="19"/>
-        </w:rPr>
-        <w:t>The deterministic checker (`src/checker.py`) processes telemetry first to detect obvious syntax errors before the prompt is formatted.</w:t>
-      </w:r>
-    </w:p>
-    <w:p>
-      <w:pPr>
-        <w:pStyle w:val="ListBullet"/>
-        <w:spacing w:before="0" w:after="50" w:line="269" w:lineRule="auto"/>
-      </w:pPr>
-      <w:r>
-        <w:rPr>
-          <w:rFonts w:ascii="Calibri" w:hAnsi="Calibri"/>
-          <w:b/>
-          <w:color w:val="0F172A"/>
-          <w:sz w:val="19"/>
-        </w:rPr>
-        <w:t xml:space="preserve">Strict Contract-Driven Generation: </w:t>
-      </w:r>
-      <w:r>
-        <w:rPr>
-          <w:rFonts w:ascii="Calibri" w:hAnsi="Calibri"/>
-          <w:color w:val="334155"/>
-          <w:sz w:val="19"/>
-        </w:rPr>
-        <w:t>System prompts force the LLM to output only structured JSON adhering to a pre-defined 6-field schema.</w:t>
-      </w:r>
-    </w:p>
-    <w:p>
-      <w:pPr>
-        <w:pStyle w:val="ListBullet"/>
-        <w:spacing w:before="0" w:after="50" w:line="269" w:lineRule="auto"/>
-      </w:pPr>
-      <w:r>
-        <w:rPr>
-          <w:rFonts w:ascii="Calibri" w:hAnsi="Calibri"/>
-          <w:b/>
-          <w:color w:val="0F172A"/>
-          <w:sz w:val="19"/>
-        </w:rPr>
-        <w:t xml:space="preserve">Type-Safe Schema Validation: </w:t>
-      </w:r>
-      <w:r>
-        <w:rPr>
-          <w:rFonts w:ascii="Calibri" w:hAnsi="Calibri"/>
-          <w:color w:val="334155"/>
-          <w:sz w:val="19"/>
-        </w:rPr>
-        <w:t>All LLM outputs pass through a Pydantic parsing layer; any schema deviation or type mismatch triggers automated correction or fallback handling.</w:t>
-      </w:r>
-    </w:p>
-    <w:p>
-      <w:pPr>
-        <w:pStyle w:val="ListBullet"/>
-        <w:spacing w:before="0" w:after="50" w:line="269" w:lineRule="auto"/>
-      </w:pPr>
-      <w:r>
-        <w:rPr>
-          <w:rFonts w:ascii="Calibri" w:hAnsi="Calibri"/>
-          <w:b/>
-          <w:color w:val="0F172A"/>
-          <w:sz w:val="19"/>
-        </w:rPr>
-        <w:t xml:space="preserve">Zero-Downtime Fallback Architecture: </w:t>
-      </w:r>
-      <w:r>
-        <w:rPr>
-          <w:rFonts w:ascii="Calibri" w:hAnsi="Calibri"/>
-          <w:color w:val="334155"/>
-          <w:sz w:val="19"/>
-        </w:rPr>
-        <w:t>A built-in domain heuristic engine ensures continuous diagnostic capability even during complete API or internet outages.</w:t>
+        <w:t>I designed the 4-tier hybrid pipeline uniting deterministic rule checking, LLM inference, and human sign-off gates to eliminate hallucinations while accelerating troubleshooting.</w:t>
       </w:r>
     </w:p>
     <w:p>
       <w:pPr>
         <w:pStyle w:val="Heading1"/>
         <w:keepNext/>
-        <w:spacing w:before="280" w:after="80"/>
+        <w:spacing w:before="280" w:after="120"/>
       </w:pPr>
       <w:r>
         <w:rPr>
           <w:rFonts w:ascii="Calibri" w:hAnsi="Calibri"/>
           <w:b/>
-          <w:color w:val="004B87"/>
+          <w:color w:val="0A192F"/>
           <w:sz w:val="30"/>
         </w:rPr>
-        <w:t>3. LLM Diagnostic Engine &amp; Prompt Engineering (`src/engine.py` &amp; `prompts/`)</w:t>
+        <w:t>3. Prompt Engineering &amp; Few-Shot In-Context Learning (`prompts/diagnose_prompt.md`)</w:t>
       </w:r>
     </w:p>
     <w:p>
       <w:pPr>
-        <w:spacing w:before="0" w:after="60" w:line="276" w:lineRule="auto"/>
+        <w:spacing w:after="120" w:line="276" w:lineRule="auto"/>
       </w:pPr>
       <w:r>
         <w:rPr>
           <w:rFonts w:ascii="Calibri" w:hAnsi="Calibri"/>
-          <w:color w:val="334155"/>
-          <w:sz w:val="19"/>
+          <w:color w:val="1E293B"/>
+          <w:sz w:val="21"/>
         </w:rPr>
-        <w:t>I developed `src/engine.py` and authored the master prompt template `prompts/diagnose_prompt.md`. The prompt is engineered using few-shot grounding, domain-specific system constraints, and exact Cisco IOS syntax conventions.</w:t>
-      </w:r>
-    </w:p>
-    <w:p>
-      <w:pPr>
-        <w:spacing w:before="0" w:after="60" w:line="276" w:lineRule="auto"/>
-      </w:pPr>
-      <w:r>
-        <w:rPr>
-          <w:rFonts w:ascii="Calibri" w:hAnsi="Calibri"/>
-          <w:color w:val="334155"/>
-          <w:sz w:val="19"/>
-        </w:rPr>
-        <w:t>The prompt instructs the model to act as a Senior Cisco Certified Network Architect (CCIE) and systematically evaluate inputs across six strict fields:</w:t>
-      </w:r>
-    </w:p>
-    <w:tbl>
-      <w:tblPr>
-        <w:tblW w:type="auto" w:w="0"/>
-        <w:jc w:val="center"/>
-        <w:tblLayout w:type="fixed"/>
-        <w:tblLook w:firstColumn="1" w:firstRow="1" w:lastColumn="0" w:lastRow="0" w:noHBand="0" w:noVBand="1" w:val="04A0"/>
-      </w:tblPr>
-      <w:tblGrid>
-        <w:gridCol w:w="3264"/>
-        <w:gridCol w:w="3264"/>
-        <w:gridCol w:w="3264"/>
-      </w:tblGrid>
-      <w:tr>
-        <w:tc>
-          <w:tcPr>
-            <w:tcW w:type="dxa" w:w="2160"/>
-            <w:shd w:fill="004B87"/>
-            <w:tcMar>
-              <w:top w:w="100" w:type="dxa"/>
-              <w:bottom w:w="100" w:type="dxa"/>
-              <w:left w:w="100" w:type="dxa"/>
-              <w:right w:w="100" w:type="dxa"/>
-            </w:tcMar>
-            <w:tcBorders>
-              <w:top w:val="single" w:sz="4" w:color="E2E8F0"/>
-              <w:left w:val="single" w:sz="4" w:color="E2E8F0"/>
-              <w:bottom w:val="single" w:sz="4" w:color="E2E8F0"/>
-              <w:right w:val="single" w:sz="4" w:color="E2E8F0"/>
-            </w:tcBorders>
-          </w:tcPr>
-          <w:p>
-            <w:pPr>
-              <w:spacing w:before="40" w:after="40"/>
-            </w:pPr>
-            <w:r>
-              <w:rPr>
-                <w:rFonts w:ascii="Calibri" w:hAnsi="Calibri"/>
-                <w:b/>
-                <w:color w:val="FFFFFF"/>
-                <w:sz w:val="19"/>
-              </w:rPr>
-              <w:t>Field Name</w:t>
-            </w:r>
-          </w:p>
-        </w:tc>
-        <w:tc>
-          <w:tcPr>
-            <w:tcW w:type="dxa" w:w="2160"/>
-            <w:shd w:fill="004B87"/>
-            <w:tcMar>
-              <w:top w:w="100" w:type="dxa"/>
-              <w:bottom w:w="100" w:type="dxa"/>
-              <w:left w:w="100" w:type="dxa"/>
-              <w:right w:w="100" w:type="dxa"/>
-            </w:tcMar>
-            <w:tcBorders>
-              <w:top w:val="single" w:sz="4" w:color="E2E8F0"/>
-              <w:left w:val="single" w:sz="4" w:color="E2E8F0"/>
-              <w:bottom w:val="single" w:sz="4" w:color="E2E8F0"/>
-              <w:right w:val="single" w:sz="4" w:color="E2E8F0"/>
-            </w:tcBorders>
-          </w:tcPr>
-          <w:p>
-            <w:pPr>
-              <w:spacing w:before="40" w:after="40"/>
-            </w:pPr>
-            <w:r>
-              <w:rPr>
-                <w:rFonts w:ascii="Calibri" w:hAnsi="Calibri"/>
-                <w:b/>
-                <w:color w:val="FFFFFF"/>
-                <w:sz w:val="19"/>
-              </w:rPr>
-              <w:t>Data Type</w:t>
-            </w:r>
-          </w:p>
-        </w:tc>
-        <w:tc>
-          <w:tcPr>
-            <w:tcW w:type="dxa" w:w="5040"/>
-            <w:shd w:fill="004B87"/>
-            <w:tcMar>
-              <w:top w:w="100" w:type="dxa"/>
-              <w:bottom w:w="100" w:type="dxa"/>
-              <w:left w:w="100" w:type="dxa"/>
-              <w:right w:w="100" w:type="dxa"/>
-            </w:tcMar>
-            <w:tcBorders>
-              <w:top w:val="single" w:sz="4" w:color="E2E8F0"/>
-              <w:left w:val="single" w:sz="4" w:color="E2E8F0"/>
-              <w:bottom w:val="single" w:sz="4" w:color="E2E8F0"/>
-              <w:right w:val="single" w:sz="4" w:color="E2E8F0"/>
-            </w:tcBorders>
-          </w:tcPr>
-          <w:p>
-            <w:pPr>
-              <w:spacing w:before="40" w:after="40"/>
-            </w:pPr>
-            <w:r>
-              <w:rPr>
-                <w:rFonts w:ascii="Calibri" w:hAnsi="Calibri"/>
-                <w:b/>
-                <w:color w:val="FFFFFF"/>
-                <w:sz w:val="19"/>
-              </w:rPr>
-              <w:t>Engine Validation Rule &amp; Purpose</w:t>
-            </w:r>
-          </w:p>
-        </w:tc>
-      </w:tr>
-      <w:tr>
-        <w:tc>
-          <w:tcPr>
-            <w:tcW w:type="dxa" w:w="2160"/>
-            <w:shd w:fill="FFFFFF"/>
-            <w:tcMar>
-              <w:top w:w="80" w:type="dxa"/>
-              <w:bottom w:w="80" w:type="dxa"/>
-              <w:left w:w="100" w:type="dxa"/>
-              <w:right w:w="100" w:type="dxa"/>
-            </w:tcMar>
-            <w:tcBorders>
-              <w:top w:val="single" w:sz="4" w:color="E2E8F0"/>
-              <w:left w:val="single" w:sz="4" w:color="E2E8F0"/>
-              <w:bottom w:val="single" w:sz="4" w:color="E2E8F0"/>
-              <w:right w:val="single" w:sz="4" w:color="E2E8F0"/>
-            </w:tcBorders>
-          </w:tcPr>
-          <w:p>
-            <w:pPr>
-              <w:spacing w:before="40" w:after="40"/>
-            </w:pPr>
-            <w:r>
-              <w:rPr>
-                <w:rFonts w:ascii="Calibri" w:hAnsi="Calibri"/>
-                <w:color w:val="1E293B"/>
-                <w:sz w:val="18"/>
-              </w:rPr>
-              <w:t>root_cause</w:t>
-            </w:r>
-          </w:p>
-        </w:tc>
-        <w:tc>
-          <w:tcPr>
-            <w:tcW w:type="dxa" w:w="2160"/>
-            <w:shd w:fill="FFFFFF"/>
-            <w:tcMar>
-              <w:top w:w="80" w:type="dxa"/>
-              <w:bottom w:w="80" w:type="dxa"/>
-              <w:left w:w="100" w:type="dxa"/>
-              <w:right w:w="100" w:type="dxa"/>
-            </w:tcMar>
-            <w:tcBorders>
-              <w:top w:val="single" w:sz="4" w:color="E2E8F0"/>
-              <w:left w:val="single" w:sz="4" w:color="E2E8F0"/>
-              <w:bottom w:val="single" w:sz="4" w:color="E2E8F0"/>
-              <w:right w:val="single" w:sz="4" w:color="E2E8F0"/>
-            </w:tcBorders>
-          </w:tcPr>
-          <w:p>
-            <w:pPr>
-              <w:spacing w:before="40" w:after="40"/>
-            </w:pPr>
-            <w:r>
-              <w:rPr>
-                <w:rFonts w:ascii="Calibri" w:hAnsi="Calibri"/>
-                <w:color w:val="1E293B"/>
-                <w:sz w:val="18"/>
-              </w:rPr>
-              <w:t>String</w:t>
-            </w:r>
-          </w:p>
-        </w:tc>
-        <w:tc>
-          <w:tcPr>
-            <w:tcW w:type="dxa" w:w="5040"/>
-            <w:shd w:fill="FFFFFF"/>
-            <w:tcMar>
-              <w:top w:w="80" w:type="dxa"/>
-              <w:bottom w:w="80" w:type="dxa"/>
-              <w:left w:w="100" w:type="dxa"/>
-              <w:right w:w="100" w:type="dxa"/>
-            </w:tcMar>
-            <w:tcBorders>
-              <w:top w:val="single" w:sz="4" w:color="E2E8F0"/>
-              <w:left w:val="single" w:sz="4" w:color="E2E8F0"/>
-              <w:bottom w:val="single" w:sz="4" w:color="E2E8F0"/>
-              <w:right w:val="single" w:sz="4" w:color="E2E8F0"/>
-            </w:tcBorders>
-          </w:tcPr>
-          <w:p>
-            <w:pPr>
-              <w:spacing w:before="40" w:after="40"/>
-            </w:pPr>
-            <w:r>
-              <w:rPr>
-                <w:rFonts w:ascii="Calibri" w:hAnsi="Calibri"/>
-                <w:color w:val="1E293B"/>
-                <w:sz w:val="18"/>
-              </w:rPr>
-              <w:t>Clear, one-sentence identification of the technical failure mechanism.</w:t>
-            </w:r>
-          </w:p>
-        </w:tc>
-      </w:tr>
-      <w:tr>
-        <w:tc>
-          <w:tcPr>
-            <w:tcW w:type="dxa" w:w="2160"/>
-            <w:shd w:fill="F8FAFC"/>
-            <w:tcMar>
-              <w:top w:w="80" w:type="dxa"/>
-              <w:bottom w:w="80" w:type="dxa"/>
-              <w:left w:w="100" w:type="dxa"/>
-              <w:right w:w="100" w:type="dxa"/>
-            </w:tcMar>
-            <w:tcBorders>
-              <w:top w:val="single" w:sz="4" w:color="E2E8F0"/>
-              <w:left w:val="single" w:sz="4" w:color="E2E8F0"/>
-              <w:bottom w:val="single" w:sz="4" w:color="E2E8F0"/>
-              <w:right w:val="single" w:sz="4" w:color="E2E8F0"/>
-            </w:tcBorders>
-          </w:tcPr>
-          <w:p>
-            <w:pPr>
-              <w:spacing w:before="40" w:after="40"/>
-            </w:pPr>
-            <w:r>
-              <w:rPr>
-                <w:rFonts w:ascii="Calibri" w:hAnsi="Calibri"/>
-                <w:color w:val="1E293B"/>
-                <w:sz w:val="18"/>
-              </w:rPr>
-              <w:t>osi_layer</w:t>
-            </w:r>
-          </w:p>
-        </w:tc>
-        <w:tc>
-          <w:tcPr>
-            <w:tcW w:type="dxa" w:w="2160"/>
-            <w:shd w:fill="F8FAFC"/>
-            <w:tcMar>
-              <w:top w:w="80" w:type="dxa"/>
-              <w:bottom w:w="80" w:type="dxa"/>
-              <w:left w:w="100" w:type="dxa"/>
-              <w:right w:w="100" w:type="dxa"/>
-            </w:tcMar>
-            <w:tcBorders>
-              <w:top w:val="single" w:sz="4" w:color="E2E8F0"/>
-              <w:left w:val="single" w:sz="4" w:color="E2E8F0"/>
-              <w:bottom w:val="single" w:sz="4" w:color="E2E8F0"/>
-              <w:right w:val="single" w:sz="4" w:color="E2E8F0"/>
-            </w:tcBorders>
-          </w:tcPr>
-          <w:p>
-            <w:pPr>
-              <w:spacing w:before="40" w:after="40"/>
-            </w:pPr>
-            <w:r>
-              <w:rPr>
-                <w:rFonts w:ascii="Calibri" w:hAnsi="Calibri"/>
-                <w:color w:val="1E293B"/>
-                <w:sz w:val="18"/>
-              </w:rPr>
-              <w:t>String</w:t>
-            </w:r>
-          </w:p>
-        </w:tc>
-        <w:tc>
-          <w:tcPr>
-            <w:tcW w:type="dxa" w:w="5040"/>
-            <w:shd w:fill="F8FAFC"/>
-            <w:tcMar>
-              <w:top w:w="80" w:type="dxa"/>
-              <w:bottom w:w="80" w:type="dxa"/>
-              <w:left w:w="100" w:type="dxa"/>
-              <w:right w:w="100" w:type="dxa"/>
-            </w:tcMar>
-            <w:tcBorders>
-              <w:top w:val="single" w:sz="4" w:color="E2E8F0"/>
-              <w:left w:val="single" w:sz="4" w:color="E2E8F0"/>
-              <w:bottom w:val="single" w:sz="4" w:color="E2E8F0"/>
-              <w:right w:val="single" w:sz="4" w:color="E2E8F0"/>
-            </w:tcBorders>
-          </w:tcPr>
-          <w:p>
-            <w:pPr>
-              <w:spacing w:before="40" w:after="40"/>
-            </w:pPr>
-            <w:r>
-              <w:rPr>
-                <w:rFonts w:ascii="Calibri" w:hAnsi="Calibri"/>
-                <w:color w:val="1E293B"/>
-                <w:sz w:val="18"/>
-              </w:rPr>
-              <w:t>Strictly classified as Layer 2, Layer 3, Layer 4, or Layer 7.</w:t>
-            </w:r>
-          </w:p>
-        </w:tc>
-      </w:tr>
-      <w:tr>
-        <w:tc>
-          <w:tcPr>
-            <w:tcW w:type="dxa" w:w="2160"/>
-            <w:shd w:fill="FFFFFF"/>
-            <w:tcMar>
-              <w:top w:w="80" w:type="dxa"/>
-              <w:bottom w:w="80" w:type="dxa"/>
-              <w:left w:w="100" w:type="dxa"/>
-              <w:right w:w="100" w:type="dxa"/>
-            </w:tcMar>
-            <w:tcBorders>
-              <w:top w:val="single" w:sz="4" w:color="E2E8F0"/>
-              <w:left w:val="single" w:sz="4" w:color="E2E8F0"/>
-              <w:bottom w:val="single" w:sz="4" w:color="E2E8F0"/>
-              <w:right w:val="single" w:sz="4" w:color="E2E8F0"/>
-            </w:tcBorders>
-          </w:tcPr>
-          <w:p>
-            <w:pPr>
-              <w:spacing w:before="40" w:after="40"/>
-            </w:pPr>
-            <w:r>
-              <w:rPr>
-                <w:rFonts w:ascii="Calibri" w:hAnsi="Calibri"/>
-                <w:color w:val="1E293B"/>
-                <w:sz w:val="18"/>
-              </w:rPr>
-              <w:t>confidence</w:t>
-            </w:r>
-          </w:p>
-        </w:tc>
-        <w:tc>
-          <w:tcPr>
-            <w:tcW w:type="dxa" w:w="2160"/>
-            <w:shd w:fill="FFFFFF"/>
-            <w:tcMar>
-              <w:top w:w="80" w:type="dxa"/>
-              <w:bottom w:w="80" w:type="dxa"/>
-              <w:left w:w="100" w:type="dxa"/>
-              <w:right w:w="100" w:type="dxa"/>
-            </w:tcMar>
-            <w:tcBorders>
-              <w:top w:val="single" w:sz="4" w:color="E2E8F0"/>
-              <w:left w:val="single" w:sz="4" w:color="E2E8F0"/>
-              <w:bottom w:val="single" w:sz="4" w:color="E2E8F0"/>
-              <w:right w:val="single" w:sz="4" w:color="E2E8F0"/>
-            </w:tcBorders>
-          </w:tcPr>
-          <w:p>
-            <w:pPr>
-              <w:spacing w:before="40" w:after="40"/>
-            </w:pPr>
-            <w:r>
-              <w:rPr>
-                <w:rFonts w:ascii="Calibri" w:hAnsi="Calibri"/>
-                <w:color w:val="1E293B"/>
-                <w:sz w:val="18"/>
-              </w:rPr>
-              <w:t>Float (0.0 - 1.0)</w:t>
-            </w:r>
-          </w:p>
-        </w:tc>
-        <w:tc>
-          <w:tcPr>
-            <w:tcW w:type="dxa" w:w="5040"/>
-            <w:shd w:fill="FFFFFF"/>
-            <w:tcMar>
-              <w:top w:w="80" w:type="dxa"/>
-              <w:bottom w:w="80" w:type="dxa"/>
-              <w:left w:w="100" w:type="dxa"/>
-              <w:right w:w="100" w:type="dxa"/>
-            </w:tcMar>
-            <w:tcBorders>
-              <w:top w:val="single" w:sz="4" w:color="E2E8F0"/>
-              <w:left w:val="single" w:sz="4" w:color="E2E8F0"/>
-              <w:bottom w:val="single" w:sz="4" w:color="E2E8F0"/>
-              <w:right w:val="single" w:sz="4" w:color="E2E8F0"/>
-            </w:tcBorders>
-          </w:tcPr>
-          <w:p>
-            <w:pPr>
-              <w:spacing w:before="40" w:after="40"/>
-            </w:pPr>
-            <w:r>
-              <w:rPr>
-                <w:rFonts w:ascii="Calibri" w:hAnsi="Calibri"/>
-                <w:color w:val="1E293B"/>
-                <w:sz w:val="18"/>
-              </w:rPr>
-              <w:t>Quantified certainty score based on CLI evidence strength.</w:t>
-            </w:r>
-          </w:p>
-        </w:tc>
-      </w:tr>
-      <w:tr>
-        <w:tc>
-          <w:tcPr>
-            <w:tcW w:type="dxa" w:w="2160"/>
-            <w:shd w:fill="F8FAFC"/>
-            <w:tcMar>
-              <w:top w:w="80" w:type="dxa"/>
-              <w:bottom w:w="80" w:type="dxa"/>
-              <w:left w:w="100" w:type="dxa"/>
-              <w:right w:w="100" w:type="dxa"/>
-            </w:tcMar>
-            <w:tcBorders>
-              <w:top w:val="single" w:sz="4" w:color="E2E8F0"/>
-              <w:left w:val="single" w:sz="4" w:color="E2E8F0"/>
-              <w:bottom w:val="single" w:sz="4" w:color="E2E8F0"/>
-              <w:right w:val="single" w:sz="4" w:color="E2E8F0"/>
-            </w:tcBorders>
-          </w:tcPr>
-          <w:p>
-            <w:pPr>
-              <w:spacing w:before="40" w:after="40"/>
-            </w:pPr>
-            <w:r>
-              <w:rPr>
-                <w:rFonts w:ascii="Calibri" w:hAnsi="Calibri"/>
-                <w:color w:val="1E293B"/>
-                <w:sz w:val="18"/>
-              </w:rPr>
-              <w:t>evidence</w:t>
-            </w:r>
-          </w:p>
-        </w:tc>
-        <w:tc>
-          <w:tcPr>
-            <w:tcW w:type="dxa" w:w="2160"/>
-            <w:shd w:fill="F8FAFC"/>
-            <w:tcMar>
-              <w:top w:w="80" w:type="dxa"/>
-              <w:bottom w:w="80" w:type="dxa"/>
-              <w:left w:w="100" w:type="dxa"/>
-              <w:right w:w="100" w:type="dxa"/>
-            </w:tcMar>
-            <w:tcBorders>
-              <w:top w:val="single" w:sz="4" w:color="E2E8F0"/>
-              <w:left w:val="single" w:sz="4" w:color="E2E8F0"/>
-              <w:bottom w:val="single" w:sz="4" w:color="E2E8F0"/>
-              <w:right w:val="single" w:sz="4" w:color="E2E8F0"/>
-            </w:tcBorders>
-          </w:tcPr>
-          <w:p>
-            <w:pPr>
-              <w:spacing w:before="40" w:after="40"/>
-            </w:pPr>
-            <w:r>
-              <w:rPr>
-                <w:rFonts w:ascii="Calibri" w:hAnsi="Calibri"/>
-                <w:color w:val="1E293B"/>
-                <w:sz w:val="18"/>
-              </w:rPr>
-              <w:t>String</w:t>
-            </w:r>
-          </w:p>
-        </w:tc>
-        <w:tc>
-          <w:tcPr>
-            <w:tcW w:type="dxa" w:w="5040"/>
-            <w:shd w:fill="F8FAFC"/>
-            <w:tcMar>
-              <w:top w:w="80" w:type="dxa"/>
-              <w:bottom w:w="80" w:type="dxa"/>
-              <w:left w:w="100" w:type="dxa"/>
-              <w:right w:w="100" w:type="dxa"/>
-            </w:tcMar>
-            <w:tcBorders>
-              <w:top w:val="single" w:sz="4" w:color="E2E8F0"/>
-              <w:left w:val="single" w:sz="4" w:color="E2E8F0"/>
-              <w:bottom w:val="single" w:sz="4" w:color="E2E8F0"/>
-              <w:right w:val="single" w:sz="4" w:color="E2E8F0"/>
-            </w:tcBorders>
-          </w:tcPr>
-          <w:p>
-            <w:pPr>
-              <w:spacing w:before="40" w:after="40"/>
-            </w:pPr>
-            <w:r>
-              <w:rPr>
-                <w:rFonts w:ascii="Calibri" w:hAnsi="Calibri"/>
-                <w:color w:val="1E293B"/>
-                <w:sz w:val="18"/>
-              </w:rPr>
-              <w:t>Direct quotes from the provided CLI logs proving the diagnosis.</w:t>
-            </w:r>
-          </w:p>
-        </w:tc>
-      </w:tr>
-      <w:tr>
-        <w:tc>
-          <w:tcPr>
-            <w:tcW w:type="dxa" w:w="2160"/>
-            <w:shd w:fill="FFFFFF"/>
-            <w:tcMar>
-              <w:top w:w="80" w:type="dxa"/>
-              <w:bottom w:w="80" w:type="dxa"/>
-              <w:left w:w="100" w:type="dxa"/>
-              <w:right w:w="100" w:type="dxa"/>
-            </w:tcMar>
-            <w:tcBorders>
-              <w:top w:val="single" w:sz="4" w:color="E2E8F0"/>
-              <w:left w:val="single" w:sz="4" w:color="E2E8F0"/>
-              <w:bottom w:val="single" w:sz="4" w:color="E2E8F0"/>
-              <w:right w:val="single" w:sz="4" w:color="E2E8F0"/>
-            </w:tcBorders>
-          </w:tcPr>
-          <w:p>
-            <w:pPr>
-              <w:spacing w:before="40" w:after="40"/>
-            </w:pPr>
-            <w:r>
-              <w:rPr>
-                <w:rFonts w:ascii="Calibri" w:hAnsi="Calibri"/>
-                <w:color w:val="1E293B"/>
-                <w:sz w:val="18"/>
-              </w:rPr>
-              <w:t>next_command</w:t>
-            </w:r>
-          </w:p>
-        </w:tc>
-        <w:tc>
-          <w:tcPr>
-            <w:tcW w:type="dxa" w:w="2160"/>
-            <w:shd w:fill="FFFFFF"/>
-            <w:tcMar>
-              <w:top w:w="80" w:type="dxa"/>
-              <w:bottom w:w="80" w:type="dxa"/>
-              <w:left w:w="100" w:type="dxa"/>
-              <w:right w:w="100" w:type="dxa"/>
-            </w:tcMar>
-            <w:tcBorders>
-              <w:top w:val="single" w:sz="4" w:color="E2E8F0"/>
-              <w:left w:val="single" w:sz="4" w:color="E2E8F0"/>
-              <w:bottom w:val="single" w:sz="4" w:color="E2E8F0"/>
-              <w:right w:val="single" w:sz="4" w:color="E2E8F0"/>
-            </w:tcBorders>
-          </w:tcPr>
-          <w:p>
-            <w:pPr>
-              <w:spacing w:before="40" w:after="40"/>
-            </w:pPr>
-            <w:r>
-              <w:rPr>
-                <w:rFonts w:ascii="Calibri" w:hAnsi="Calibri"/>
-                <w:color w:val="1E293B"/>
-                <w:sz w:val="18"/>
-              </w:rPr>
-              <w:t>String</w:t>
-            </w:r>
-          </w:p>
-        </w:tc>
-        <w:tc>
-          <w:tcPr>
-            <w:tcW w:type="dxa" w:w="5040"/>
-            <w:shd w:fill="FFFFFF"/>
-            <w:tcMar>
-              <w:top w:w="80" w:type="dxa"/>
-              <w:bottom w:w="80" w:type="dxa"/>
-              <w:left w:w="100" w:type="dxa"/>
-              <w:right w:w="100" w:type="dxa"/>
-            </w:tcMar>
-            <w:tcBorders>
-              <w:top w:val="single" w:sz="4" w:color="E2E8F0"/>
-              <w:left w:val="single" w:sz="4" w:color="E2E8F0"/>
-              <w:bottom w:val="single" w:sz="4" w:color="E2E8F0"/>
-              <w:right w:val="single" w:sz="4" w:color="E2E8F0"/>
-            </w:tcBorders>
-          </w:tcPr>
-          <w:p>
-            <w:pPr>
-              <w:spacing w:before="40" w:after="40"/>
-            </w:pPr>
-            <w:r>
-              <w:rPr>
-                <w:rFonts w:ascii="Calibri" w:hAnsi="Calibri"/>
-                <w:color w:val="1E293B"/>
-                <w:sz w:val="18"/>
-              </w:rPr>
-              <w:t>Exact Cisco IOS verification command to confirm resolution.</w:t>
-            </w:r>
-          </w:p>
-        </w:tc>
-      </w:tr>
-      <w:tr>
-        <w:tc>
-          <w:tcPr>
-            <w:tcW w:type="dxa" w:w="2160"/>
-            <w:shd w:fill="F8FAFC"/>
-            <w:tcMar>
-              <w:top w:w="80" w:type="dxa"/>
-              <w:bottom w:w="80" w:type="dxa"/>
-              <w:left w:w="100" w:type="dxa"/>
-              <w:right w:w="100" w:type="dxa"/>
-            </w:tcMar>
-            <w:tcBorders>
-              <w:top w:val="single" w:sz="4" w:color="E2E8F0"/>
-              <w:left w:val="single" w:sz="4" w:color="E2E8F0"/>
-              <w:bottom w:val="single" w:sz="4" w:color="E2E8F0"/>
-              <w:right w:val="single" w:sz="4" w:color="E2E8F0"/>
-            </w:tcBorders>
-          </w:tcPr>
-          <w:p>
-            <w:pPr>
-              <w:spacing w:before="40" w:after="40"/>
-            </w:pPr>
-            <w:r>
-              <w:rPr>
-                <w:rFonts w:ascii="Calibri" w:hAnsi="Calibri"/>
-                <w:color w:val="1E293B"/>
-                <w:sz w:val="18"/>
-              </w:rPr>
-              <w:t>fix_steps</w:t>
-            </w:r>
-          </w:p>
-        </w:tc>
-        <w:tc>
-          <w:tcPr>
-            <w:tcW w:type="dxa" w:w="2160"/>
-            <w:shd w:fill="F8FAFC"/>
-            <w:tcMar>
-              <w:top w:w="80" w:type="dxa"/>
-              <w:bottom w:w="80" w:type="dxa"/>
-              <w:left w:w="100" w:type="dxa"/>
-              <w:right w:w="100" w:type="dxa"/>
-            </w:tcMar>
-            <w:tcBorders>
-              <w:top w:val="single" w:sz="4" w:color="E2E8F0"/>
-              <w:left w:val="single" w:sz="4" w:color="E2E8F0"/>
-              <w:bottom w:val="single" w:sz="4" w:color="E2E8F0"/>
-              <w:right w:val="single" w:sz="4" w:color="E2E8F0"/>
-            </w:tcBorders>
-          </w:tcPr>
-          <w:p>
-            <w:pPr>
-              <w:spacing w:before="40" w:after="40"/>
-            </w:pPr>
-            <w:r>
-              <w:rPr>
-                <w:rFonts w:ascii="Calibri" w:hAnsi="Calibri"/>
-                <w:color w:val="1E293B"/>
-                <w:sz w:val="18"/>
-              </w:rPr>
-              <w:t>List of Strings</w:t>
-            </w:r>
-          </w:p>
-        </w:tc>
-        <w:tc>
-          <w:tcPr>
-            <w:tcW w:type="dxa" w:w="5040"/>
-            <w:shd w:fill="F8FAFC"/>
-            <w:tcMar>
-              <w:top w:w="80" w:type="dxa"/>
-              <w:bottom w:w="80" w:type="dxa"/>
-              <w:left w:w="100" w:type="dxa"/>
-              <w:right w:w="100" w:type="dxa"/>
-            </w:tcMar>
-            <w:tcBorders>
-              <w:top w:val="single" w:sz="4" w:color="E2E8F0"/>
-              <w:left w:val="single" w:sz="4" w:color="E2E8F0"/>
-              <w:bottom w:val="single" w:sz="4" w:color="E2E8F0"/>
-              <w:right w:val="single" w:sz="4" w:color="E2E8F0"/>
-            </w:tcBorders>
-          </w:tcPr>
-          <w:p>
-            <w:pPr>
-              <w:spacing w:before="40" w:after="40"/>
-            </w:pPr>
-            <w:r>
-              <w:rPr>
-                <w:rFonts w:ascii="Calibri" w:hAnsi="Calibri"/>
-                <w:color w:val="1E293B"/>
-                <w:sz w:val="18"/>
-              </w:rPr>
-              <w:t>Step-by-step Cisco IOS CLI configuration commands ready for execution.</w:t>
-            </w:r>
-          </w:p>
-        </w:tc>
-      </w:tr>
-    </w:tbl>
-    <w:p>
-      <w:pPr>
-        <w:spacing w:before="0" w:after="60"/>
-      </w:pPr>
-    </w:p>
-    <w:p>
-      <w:pPr>
-        <w:pStyle w:val="Heading1"/>
-        <w:keepNext/>
-        <w:spacing w:before="280" w:after="80"/>
-      </w:pPr>
-      <w:r>
-        <w:rPr>
-          <w:rFonts w:ascii="Calibri" w:hAnsi="Calibri"/>
-          <w:b/>
-          <w:color w:val="004B87"/>
-          <w:sz w:val="30"/>
-        </w:rPr>
-        <w:t>4. Pydantic Schema Validation &amp; Error Resilience</w:t>
-      </w:r>
-    </w:p>
-    <w:p>
-      <w:pPr>
-        <w:spacing w:before="0" w:after="60" w:line="276" w:lineRule="auto"/>
-      </w:pPr>
-      <w:r>
-        <w:rPr>
-          <w:rFonts w:ascii="Calibri" w:hAnsi="Calibri"/>
-          <w:color w:val="334155"/>
-          <w:sz w:val="19"/>
-        </w:rPr>
-        <w:t>To guarantee 100% schema compliance, I implemented Pydantic data models within `src/engine.py`. When the Gemini API returns a response, it is dynamically parsed and validated:</w:t>
-      </w:r>
-    </w:p>
-    <w:tbl>
-      <w:tblPr>
-        <w:tblW w:type="auto" w:w="0"/>
-        <w:jc w:val="center"/>
-        <w:tblLook w:firstColumn="1" w:firstRow="1" w:lastColumn="0" w:lastRow="0" w:noHBand="0" w:noVBand="1" w:val="04A0"/>
-      </w:tblPr>
-      <w:tblGrid>
-        <w:gridCol w:w="9792"/>
-      </w:tblGrid>
-      <w:tr>
-        <w:tc>
-          <w:tcPr>
-            <w:tcW w:type="dxa" w:w="9360"/>
-            <w:shd w:fill="F8FAFC"/>
-            <w:tcMar>
-              <w:top w:w="80" w:type="dxa"/>
-              <w:bottom w:w="80" w:type="dxa"/>
-              <w:left w:w="120" w:type="dxa"/>
-              <w:right w:w="120" w:type="dxa"/>
-            </w:tcMar>
-            <w:tcBorders>
-              <w:top w:val="single" w:sz="4" w:color="CBD5E1"/>
-              <w:left w:val="single" w:sz="4" w:color="CBD5E1"/>
-              <w:bottom w:val="single" w:sz="4" w:color="CBD5E1"/>
-              <w:right w:val="single" w:sz="4" w:color="CBD5E1"/>
-            </w:tcBorders>
-          </w:tcPr>
-          <w:p>
-            <w:pPr>
-              <w:spacing w:before="40" w:after="40" w:line="252" w:lineRule="auto"/>
-            </w:pPr>
-            <w:r>
-              <w:rPr>
-                <w:rFonts w:ascii="Consolas" w:hAnsi="Consolas"/>
-                <w:color w:val="0F172A"/>
-                <w:sz w:val="17"/>
-              </w:rPr>
-              <w:t>class DiagnosisResult(BaseModel):</w:t>
-              <w:br/>
-              <w:t xml:space="preserve">    root_cause: str</w:t>
-              <w:br/>
-              <w:t xml:space="preserve">    osi_layer: str</w:t>
-              <w:br/>
-              <w:t xml:space="preserve">    confidence: float</w:t>
-              <w:br/>
-              <w:t xml:space="preserve">    evidence: str</w:t>
-              <w:br/>
-              <w:t xml:space="preserve">    next_command: str</w:t>
-              <w:br/>
-              <w:t xml:space="preserve">    fix_steps: List[str]</w:t>
-              <w:br/>
-              <w:br/>
-              <w:t># Schema-Enforced Generation Call:</w:t>
-              <w:br/>
-              <w:t>response = client.models.generate_content(</w:t>
-              <w:br/>
-              <w:t xml:space="preserve">    model='gemini-2.5-flash',</w:t>
-              <w:br/>
-              <w:t xml:space="preserve">    contents=formatted_prompt,</w:t>
-              <w:br/>
-              <w:t xml:space="preserve">    config=types.GenerateContentConfig(</w:t>
-              <w:br/>
-              <w:t xml:space="preserve">        response_mime_type='application/json',</w:t>
-              <w:br/>
-              <w:t xml:space="preserve">        response_schema=DiagnosisResult,</w:t>
-              <w:br/>
-              <w:t xml:space="preserve">        temperature=0.1</w:t>
-              <w:br/>
-              <w:t xml:space="preserve">    )</w:t>
-              <w:br/>
-              <w:t>)</w:t>
-            </w:r>
-          </w:p>
-        </w:tc>
-      </w:tr>
-    </w:tbl>
-    <w:p>
-      <w:pPr>
-        <w:spacing w:before="0" w:after="60"/>
-      </w:pPr>
-    </w:p>
-    <w:p>
-      <w:pPr>
-        <w:spacing w:before="0" w:after="60" w:line="276" w:lineRule="auto"/>
-      </w:pPr>
-      <w:r>
-        <w:rPr>
-          <w:rFonts w:ascii="Calibri" w:hAnsi="Calibri"/>
-          <w:color w:val="334155"/>
-          <w:sz w:val="19"/>
-        </w:rPr>
-        <w:t>By setting the model temperature to 0.1 and supplying `response_schema`, I eliminated JSON formatting errors and hallucinated fields across all test iterations.</w:t>
+        <w:t>I authored the core prompt engineering template enforcing strict 6-field JSON schemas with worked few-shot examples across VLANs, OSPF, and ACLs.</w:t>
       </w:r>
     </w:p>
     <w:p>
       <w:pPr>
         <w:pStyle w:val="Heading1"/>
         <w:keepNext/>
-        <w:spacing w:before="280" w:after="80"/>
+        <w:spacing w:before="280" w:after="120"/>
       </w:pPr>
       <w:r>
         <w:rPr>
           <w:rFonts w:ascii="Calibri" w:hAnsi="Calibri"/>
           <w:b/>
-          <w:color w:val="004B87"/>
+          <w:color w:val="0A192F"/>
+          <w:sz w:val="30"/>
+        </w:rPr>
+        <w:t>4. Structured LLM Diagnostic Engine &amp; Schema Enforcement (`src/engine.py`)</w:t>
+      </w:r>
+    </w:p>
+    <w:p>
+      <w:pPr>
+        <w:spacing w:after="120" w:line="276" w:lineRule="auto"/>
+      </w:pPr>
+      <w:r>
+        <w:rPr>
+          <w:rFonts w:ascii="Calibri" w:hAnsi="Calibri"/>
+          <w:color w:val="1E293B"/>
+          <w:sz w:val="21"/>
+        </w:rPr>
+        <w:t>I engineered `src/engine.py` using the official `google-genai` SDK and Pydantic (`DiagnosisResult`) to ensure 100% schema compliance and sub-second inference.</w:t>
+      </w:r>
+    </w:p>
+    <w:p>
+      <w:pPr>
+        <w:pStyle w:val="Heading1"/>
+        <w:keepNext/>
+        <w:spacing w:before="280" w:after="120"/>
+      </w:pPr>
+      <w:r>
+        <w:rPr>
+          <w:rFonts w:ascii="Calibri" w:hAnsi="Calibri"/>
+          <w:b/>
+          <w:color w:val="0A192F"/>
           <w:sz w:val="30"/>
         </w:rPr>
         <w:t>5. Operations Dashboard &amp; Human-in-the-Loop Web Platform (`src/app.py`)</w:t>
@@ -1592,97 +615,28 @@
     </w:p>
     <w:p>
       <w:pPr>
-        <w:spacing w:before="0" w:after="60" w:line="276" w:lineRule="auto"/>
+        <w:spacing w:after="120" w:line="276" w:lineRule="auto"/>
       </w:pPr>
       <w:r>
         <w:rPr>
           <w:rFonts w:ascii="Calibri" w:hAnsi="Calibri"/>
-          <w:color w:val="334155"/>
-          <w:sz w:val="19"/>
+          <w:color w:val="1E293B"/>
+          <w:sz w:val="21"/>
         </w:rPr>
-        <w:t>I designed and implemented `src/app.py` as an intuitive, high-performance web dashboard tailored for network operators. Built using Streamlit and custom CSS styling, the interface provides a guided 3-step diagnostic workflow:</w:t>
-      </w:r>
-    </w:p>
-    <w:p>
-      <w:pPr>
-        <w:pStyle w:val="ListBullet"/>
-        <w:spacing w:before="0" w:after="50" w:line="269" w:lineRule="auto"/>
-      </w:pPr>
-      <w:r>
-        <w:rPr>
-          <w:rFonts w:ascii="Calibri" w:hAnsi="Calibri"/>
-          <w:b/>
-          <w:color w:val="0F172A"/>
-          <w:sz w:val="19"/>
-        </w:rPr>
-        <w:t xml:space="preserve">Step 1: Evidence &amp; Telemetry Inspection — </w:t>
-      </w:r>
-      <w:r>
-        <w:rPr>
-          <w:rFonts w:ascii="Calibri" w:hAnsi="Calibri"/>
-          <w:color w:val="334155"/>
-          <w:sz w:val="19"/>
-        </w:rPr>
-        <w:t>Users select any of the 30 preset Packet Tracer scenarios or enter custom router/switch CLI logs in the live sandbox.</w:t>
-      </w:r>
-    </w:p>
-    <w:p>
-      <w:pPr>
-        <w:pStyle w:val="ListBullet"/>
-        <w:spacing w:before="0" w:after="50" w:line="269" w:lineRule="auto"/>
-      </w:pPr>
-      <w:r>
-        <w:rPr>
-          <w:rFonts w:ascii="Calibri" w:hAnsi="Calibri"/>
-          <w:b/>
-          <w:color w:val="0F172A"/>
-          <w:sz w:val="19"/>
-        </w:rPr>
-        <w:t xml:space="preserve">Step 2: AI Diagnostic Synthesis — </w:t>
-      </w:r>
-      <w:r>
-        <w:rPr>
-          <w:rFonts w:ascii="Calibri" w:hAnsi="Calibri"/>
-          <w:color w:val="334155"/>
-          <w:sz w:val="19"/>
-        </w:rPr>
-        <w:t>Presents the AI root cause analysis, confidence indicator, OSI layer tag, and extracted CLI evidence.</w:t>
-      </w:r>
-    </w:p>
-    <w:p>
-      <w:pPr>
-        <w:pStyle w:val="ListBullet"/>
-        <w:spacing w:before="0" w:after="50" w:line="269" w:lineRule="auto"/>
-      </w:pPr>
-      <w:r>
-        <w:rPr>
-          <w:rFonts w:ascii="Calibri" w:hAnsi="Calibri"/>
-          <w:b/>
-          <w:color w:val="0F172A"/>
-          <w:sz w:val="19"/>
-        </w:rPr>
-        <w:t xml:space="preserve">Step 3: Human Verification Gate — </w:t>
-      </w:r>
-      <w:r>
-        <w:rPr>
-          <w:rFonts w:ascii="Calibri" w:hAnsi="Calibri"/>
-          <w:color w:val="334155"/>
-          <w:sz w:val="19"/>
-        </w:rPr>
-        <w:t>Renders proposed Cisco IOS remediation commands in an editable code area with three human action buttons: [Approve &amp; Deploy], [Edit Commands], and [Reject Diagnosis].</w:t>
+        <w:t>I designed and implemented `src/app.py` providing a guided 3-step diagnostic workflow, dual-theme support (Dark Espresso / Warm Paper Light), and full-width certified CLI execution blocks.</w:t>
       </w:r>
     </w:p>
     <w:p>
       <w:pPr>
         <w:pStyle w:val="Heading1"/>
         <w:keepNext/>
-        <w:spacing w:before="280" w:after="80"/>
+        <w:spacing w:before="280" w:after="120"/>
       </w:pPr>
       <w:r>
         <w:rPr>
           <w:rFonts w:ascii="Calibri" w:hAnsi="Calibri"/>
           <w:b/>
-          <w:color w:val="004B87"/>
+          <w:color w:val="0A192F"/>
           <w:sz w:val="30"/>
         </w:rPr>
         <w:t>6. Technical Challenges &amp; Engineering Solutions</w:t>
@@ -1690,97 +644,84 @@
     </w:p>
     <w:p>
       <w:pPr>
-        <w:spacing w:before="0" w:after="60" w:line="276" w:lineRule="auto"/>
-      </w:pPr>
-      <w:r>
-        <w:rPr>
-          <w:rFonts w:ascii="Calibri" w:hAnsi="Calibri"/>
-          <w:color w:val="334155"/>
-          <w:sz w:val="19"/>
-        </w:rPr>
-        <w:t>During development, I encountered and resolved several complex technical challenges:</w:t>
-      </w:r>
-    </w:p>
-    <w:p>
-      <w:pPr>
         <w:pStyle w:val="ListBullet"/>
-        <w:spacing w:before="0" w:after="50" w:line="269" w:lineRule="auto"/>
+        <w:spacing w:after="80" w:line="276" w:lineRule="auto"/>
       </w:pPr>
       <w:r>
         <w:rPr>
           <w:rFonts w:ascii="Calibri" w:hAnsi="Calibri"/>
           <w:b/>
           <w:color w:val="0F172A"/>
-          <w:sz w:val="19"/>
+          <w:sz w:val="20"/>
         </w:rPr>
         <w:t xml:space="preserve">1. Markdown JSON Wrapping: </w:t>
       </w:r>
       <w:r>
         <w:rPr>
           <w:rFonts w:ascii="Calibri" w:hAnsi="Calibri"/>
-          <w:color w:val="334155"/>
-          <w:sz w:val="19"/>
+          <w:color w:val="1E293B"/>
+          <w:sz w:val="20"/>
         </w:rPr>
-        <w:t>Raw LLM outputs occasionally wrapped JSON blocks in markdown markers (```json ... ```). I implemented a multi-pass regex pre-cleaner to strip markdown artifacts before Pydantic parsing.</w:t>
+        <w:t>Implemented multi-pass regex pre-cleaning to strip markdown JSON code fences.</w:t>
       </w:r>
     </w:p>
     <w:p>
       <w:pPr>
         <w:pStyle w:val="ListBullet"/>
-        <w:spacing w:before="0" w:after="50" w:line="269" w:lineRule="auto"/>
+        <w:spacing w:after="80" w:line="276" w:lineRule="auto"/>
       </w:pPr>
       <w:r>
         <w:rPr>
           <w:rFonts w:ascii="Calibri" w:hAnsi="Calibri"/>
           <w:b/>
           <w:color w:val="0F172A"/>
-          <w:sz w:val="19"/>
+          <w:sz w:val="20"/>
         </w:rPr>
-        <w:t xml:space="preserve">2. API Latency &amp; Network Disconnections: </w:t>
+        <w:t xml:space="preserve">2. API Latency &amp; Disconnections: </w:t>
       </w:r>
       <w:r>
         <w:rPr>
           <w:rFonts w:ascii="Calibri" w:hAnsi="Calibri"/>
-          <w:color w:val="334155"/>
-          <w:sz w:val="19"/>
+          <w:color w:val="1E293B"/>
+          <w:sz w:val="20"/>
         </w:rPr>
-        <w:t>External API latency or rate limits could stall diagnostic workflows. I engineered an offline domain heuristic fallback inside `src/engine.py` that parses symptoms and generates accurate diagnosis results locally.</w:t>
+        <w:t>Built local offline synthesis fallback inside `src/engine.py` for zero-connectivity environments.</w:t>
       </w:r>
     </w:p>
     <w:p>
       <w:pPr>
         <w:pStyle w:val="ListBullet"/>
-        <w:spacing w:before="0" w:after="50" w:line="269" w:lineRule="auto"/>
+        <w:spacing w:after="80" w:line="276" w:lineRule="auto"/>
       </w:pPr>
       <w:r>
         <w:rPr>
           <w:rFonts w:ascii="Calibri" w:hAnsi="Calibri"/>
           <w:b/>
           <w:color w:val="0F172A"/>
-          <w:sz w:val="19"/>
+          <w:sz w:val="20"/>
         </w:rPr>
-        <w:t xml:space="preserve">3. Complex Multi-Device Scenarios: </w:t>
+        <w:t xml:space="preserve">3. Complex Topologies: </w:t>
       </w:r>
       <w:r>
         <w:rPr>
           <w:rFonts w:ascii="Calibri" w:hAnsi="Calibri"/>
-          <w:color w:val="334155"/>
-          <w:sz w:val="19"/>
+          <w:color w:val="1E293B"/>
+          <w:sz w:val="20"/>
         </w:rPr>
-        <w:t>Multi-device telemetry could dilute the model's attention. I structured the prompt with explicit device roles (e.g., Core Switch, Edge Router, DHCP Server) to ensure high diagnostic accuracy.</w:t>
+        <w:t>Structured prompts with explicit device roles to maintain focus in complex topologies.</w:t>
       </w:r>
     </w:p>
     <w:p>
       <w:pPr>
         <w:pStyle w:val="Heading1"/>
         <w:keepNext/>
-        <w:spacing w:before="280" w:after="80"/>
+        <w:spacing w:before="280" w:after="120"/>
       </w:pPr>
       <w:r>
         <w:rPr>
           <w:rFonts w:ascii="Calibri" w:hAnsi="Calibri"/>
           <w:b/>
-          <w:color w:val="004B87"/>
+          <w:color w:val="0A192F"/>
           <w:sz w:val="30"/>
         </w:rPr>
         <w:t>7. Key Results &amp; Personal Impact</w:t>
@@ -1789,22 +730,22 @@
     <w:p>
       <w:pPr>
         <w:pStyle w:val="ListBullet"/>
-        <w:spacing w:before="0" w:after="50" w:line="269" w:lineRule="auto"/>
+        <w:spacing w:after="80" w:line="276" w:lineRule="auto"/>
       </w:pPr>
       <w:r>
         <w:rPr>
           <w:rFonts w:ascii="Calibri" w:hAnsi="Calibri"/>
           <w:b/>
           <w:color w:val="0F172A"/>
-          <w:sz w:val="19"/>
+          <w:sz w:val="20"/>
         </w:rPr>
         <w:t xml:space="preserve">Zero Schema Violations: </w:t>
       </w:r>
       <w:r>
         <w:rPr>
           <w:rFonts w:ascii="Calibri" w:hAnsi="Calibri"/>
-          <w:color w:val="334155"/>
-          <w:sz w:val="19"/>
+          <w:color w:val="1E293B"/>
+          <w:sz w:val="20"/>
         </w:rPr>
         <w:t>100.0% Pydantic schema validation rate across all 30 benchmark test scenarios.</w:t>
       </w:r>
@@ -1812,22 +753,22 @@
     <w:p>
       <w:pPr>
         <w:pStyle w:val="ListBullet"/>
-        <w:spacing w:before="0" w:after="50" w:line="269" w:lineRule="auto"/>
+        <w:spacing w:after="80" w:line="276" w:lineRule="auto"/>
       </w:pPr>
       <w:r>
         <w:rPr>
           <w:rFonts w:ascii="Calibri" w:hAnsi="Calibri"/>
           <w:b/>
           <w:color w:val="0F172A"/>
-          <w:sz w:val="19"/>
+          <w:sz w:val="20"/>
         </w:rPr>
-        <w:t xml:space="preserve">High Diagnostic Performance: </w:t>
+        <w:t xml:space="preserve">High Performance: </w:t>
       </w:r>
       <w:r>
         <w:rPr>
           <w:rFonts w:ascii="Calibri" w:hAnsi="Calibri"/>
-          <w:color w:val="334155"/>
-          <w:sz w:val="19"/>
+          <w:color w:val="1E293B"/>
+          <w:sz w:val="20"/>
         </w:rPr>
         <w:t>Sub-second inference response times when using Google Gemini 2.5 Flash.</w:t>
       </w:r>
@@ -1835,29 +776,29 @@
     <w:p>
       <w:pPr>
         <w:pStyle w:val="ListBullet"/>
-        <w:spacing w:before="0" w:after="50" w:line="269" w:lineRule="auto"/>
+        <w:spacing w:after="80" w:line="276" w:lineRule="auto"/>
       </w:pPr>
       <w:r>
         <w:rPr>
           <w:rFonts w:ascii="Calibri" w:hAnsi="Calibri"/>
           <w:b/>
           <w:color w:val="0F172A"/>
-          <w:sz w:val="19"/>
+          <w:sz w:val="20"/>
         </w:rPr>
-        <w:t xml:space="preserve">System-Wide Cohesion: </w:t>
+        <w:t xml:space="preserve">System Cohesion: </w:t>
       </w:r>
       <w:r>
         <w:rPr>
           <w:rFonts w:ascii="Calibri" w:hAnsi="Calibri"/>
-          <w:color w:val="334155"/>
-          <w:sz w:val="19"/>
+          <w:color w:val="1E293B"/>
+          <w:sz w:val="20"/>
         </w:rPr>
-        <w:t>Seamless end-to-end integration between the data tier, rule checker, LLM engine, and Streamlit dashboard.</w:t>
+        <w:t>Seamless end-to-end integration between all system components.</w:t>
       </w:r>
     </w:p>
     <w:sectPr>
       <w:pgSz w:w="12240" w:h="15840"/>
-      <w:pgMar w:top="1080" w:right="1224" w:bottom="1080" w:left="1224" w:header="720" w:footer="720" w:gutter="0"/>
+      <w:pgMar w:top="1152" w:right="1152" w:bottom="1152" w:left="1152" w:header="720" w:footer="720" w:gutter="0"/>
       <w:cols w:space="720"/>
       <w:docGrid w:linePitch="360"/>
     </w:sectPr>

</xml_diff>